<commit_message>
fix: revert stats to original values + update CV
Co-Authored-By: Claude Opus 4.6 (1M context) <noreply@anthropic.com>
</commit_message>
<xml_diff>
--- a/public/cv/Muhammad_Hamza_Sajid_CV.docx
+++ b/public/cv/Muhammad_Hamza_Sajid_CV.docx
@@ -45,7 +45,28 @@
         </w:rPr>
         <w:t xml:space="preserve">Islamabad, Pakistan  •  codx.hamza@gmail.com  •  +92 347 886 6012  •  </w:t>
       </w:r>
-      <w:hyperlink w:history="1" r:id="rIdutcjcxe4f6ukxlzzrweyy">
+      <w:hyperlink w:history="1" r:id="rId1gtxhv7jm8jlimwhsltwl">
+        <w:r>
+          <w:rPr>
+            <w:rFonts w:ascii="Arial" w:cs="Arial" w:eastAsia="Arial" w:hAnsi="Arial"/>
+            <w:color w:val="1A56DB"/>
+            <w:sz w:val="20"/>
+            <w:szCs w:val="20"/>
+            <w:u w:val="single"/>
+          </w:rPr>
+          <w:t xml:space="preserve">muhammadhamxa.vercel.app</w:t>
+        </w:r>
+      </w:hyperlink>
+      <w:r>
+        <w:rPr>
+          <w:rFonts w:ascii="Arial" w:cs="Arial" w:eastAsia="Arial" w:hAnsi="Arial"/>
+          <w:color w:val="374151"/>
+          <w:sz w:val="20"/>
+          <w:szCs w:val="20"/>
+        </w:rPr>
+        <w:t xml:space="preserve">  •  </w:t>
+      </w:r>
+      <w:hyperlink w:history="1" r:id="rIdcbg_vkf2m-kcnfh6zs4-u">
         <w:r>
           <w:rPr>
             <w:rFonts w:ascii="Arial" w:cs="Arial" w:eastAsia="Arial" w:hAnsi="Arial"/>
@@ -370,7 +391,7 @@
       <w:pPr>
         <w:spacing w:after="20" w:before="100"/>
       </w:pPr>
-      <w:hyperlink w:history="1" r:id="rIddtqrcjv-ogmxnantou1qi">
+      <w:hyperlink w:history="1" r:id="rIdigvcraabfjnffzarcgwi7">
         <w:r>
           <w:rPr>
             <w:rStyle w:val="Hyperlink"/>
@@ -414,7 +435,7 @@
       <w:pPr>
         <w:spacing w:after="20" w:before="100"/>
       </w:pPr>
-      <w:hyperlink w:history="1" r:id="rIdlmjr2xzoqht0rs4za3gsg">
+      <w:hyperlink w:history="1" r:id="rId0_o7a-gw4snz6pvlev3fu">
         <w:r>
           <w:rPr>
             <w:rStyle w:val="Hyperlink"/>
@@ -458,7 +479,7 @@
       <w:pPr>
         <w:spacing w:after="20" w:before="100"/>
       </w:pPr>
-      <w:hyperlink w:history="1" r:id="rIdd01m99az8ra6d21-wdnbv">
+      <w:hyperlink w:history="1" r:id="rIdkniai4qugupnoqzrnlp1y">
         <w:r>
           <w:rPr>
             <w:rStyle w:val="Hyperlink"/>
@@ -502,7 +523,7 @@
       <w:pPr>
         <w:spacing w:after="20" w:before="100"/>
       </w:pPr>
-      <w:hyperlink w:history="1" r:id="rIdp543uv2cv-tjp7ndmakyd">
+      <w:hyperlink w:history="1" r:id="rIdtf9hovhl8jdftlq-4uaol">
         <w:r>
           <w:rPr>
             <w:rStyle w:val="Hyperlink"/>
@@ -805,7 +826,7 @@
             <w:pPr>
               <w:spacing w:after="0" w:before="0"/>
             </w:pPr>
-            <w:hyperlink w:history="1" r:id="rIdd3trqlq-9hk1s1226zien">
+            <w:hyperlink w:history="1" r:id="rIdfsy_0qhycee5azk5tiinu">
               <w:r>
                 <w:rPr>
                   <w:rStyle w:val="Hyperlink"/>
@@ -1004,7 +1025,7 @@
             <w:pPr>
               <w:spacing w:after="0" w:before="0"/>
             </w:pPr>
-            <w:hyperlink w:history="1" r:id="rIdpywv54uyy0-djw0j6bu-e">
+            <w:hyperlink w:history="1" r:id="rIdph0eapapzzolmuusrxlao">
               <w:r>
                 <w:rPr>
                   <w:rStyle w:val="Hyperlink"/>

</xml_diff>